<commit_message>
Aprofunda questões do caso e integra retomadas conceituais
</commit_message>
<xml_diff>
--- a/entregas/Estudo_de_Caso_O_Relatorio_Que_Nao_Ficara_Pronto.docx
+++ b/entregas/Estudo_de_Caso_O_Relatorio_Que_Nao_Ficara_Pronto.docx
@@ -345,121 +345,7 @@
           </w:tcPr>
           <w:p>
             <w:r>
-              <w:t>3. Que informações ainda estão ausentes e precisariam ser verificadas antes de avaliar responsabilidades?</w:t>
-            </w:r>
-          </w:p>
-        </w:tc>
-        <w:tc>
-          <w:tcPr>
-            <w:tcW w:type="dxa" w:w="5783"/>
-            <w:tcMar>
-              <w:top w:w="120" w:type="dxa"/>
-              <w:start w:w="160" w:type="dxa"/>
-              <w:bottom w:w="120" w:type="dxa"/>
-              <w:end w:w="160" w:type="dxa"/>
-            </w:tcMar>
-            <w:vAlign w:val="top"/>
-          </w:tcPr>
-          <w:p>
-            <w:r>
-              <w:br/>
-              <w:br/>
-              <w:br/>
-            </w:r>
-          </w:p>
-        </w:tc>
-      </w:tr>
-      <w:tr>
-        <w:tc>
-          <w:tcPr>
-            <w:tcW w:type="dxa" w:w="3515"/>
-            <w:tcMar>
-              <w:top w:w="120" w:type="dxa"/>
-              <w:start w:w="160" w:type="dxa"/>
-              <w:bottom w:w="120" w:type="dxa"/>
-              <w:end w:w="160" w:type="dxa"/>
-            </w:tcMar>
-            <w:vAlign w:val="top"/>
-          </w:tcPr>
-          <w:p>
-            <w:r>
-              <w:t>4. Quais sinais interoceptivos aparecem no gestor? O que eles informam, sem determinar uma resposta?</w:t>
-            </w:r>
-          </w:p>
-        </w:tc>
-        <w:tc>
-          <w:tcPr>
-            <w:tcW w:type="dxa" w:w="5783"/>
-            <w:tcMar>
-              <w:top w:w="120" w:type="dxa"/>
-              <w:start w:w="160" w:type="dxa"/>
-              <w:bottom w:w="120" w:type="dxa"/>
-              <w:end w:w="160" w:type="dxa"/>
-            </w:tcMar>
-            <w:vAlign w:val="top"/>
-          </w:tcPr>
-          <w:p>
-            <w:r>
-              <w:br/>
-              <w:br/>
-              <w:br/>
-            </w:r>
-          </w:p>
-        </w:tc>
-      </w:tr>
-      <w:tr>
-        <w:tc>
-          <w:tcPr>
-            <w:tcW w:type="dxa" w:w="3515"/>
-            <w:tcMar>
-              <w:top w:w="120" w:type="dxa"/>
-              <w:start w:w="160" w:type="dxa"/>
-              <w:bottom w:w="120" w:type="dxa"/>
-              <w:end w:w="160" w:type="dxa"/>
-            </w:tcMar>
-            <w:vAlign w:val="top"/>
-          </w:tcPr>
-          <w:p>
-            <w:r>
-              <w:t>5. Como você situaria o estado do gestor em termos de valência e ativação? Que emoções são possíveis?</w:t>
-            </w:r>
-          </w:p>
-        </w:tc>
-        <w:tc>
-          <w:tcPr>
-            <w:tcW w:type="dxa" w:w="5783"/>
-            <w:tcMar>
-              <w:top w:w="120" w:type="dxa"/>
-              <w:start w:w="160" w:type="dxa"/>
-              <w:bottom w:w="120" w:type="dxa"/>
-              <w:end w:w="160" w:type="dxa"/>
-            </w:tcMar>
-            <w:vAlign w:val="top"/>
-          </w:tcPr>
-          <w:p>
-            <w:r>
-              <w:br/>
-              <w:br/>
-              <w:br/>
-            </w:r>
-          </w:p>
-        </w:tc>
-      </w:tr>
-      <w:tr>
-        <w:tc>
-          <w:tcPr>
-            <w:tcW w:type="dxa" w:w="3515"/>
-            <w:tcMar>
-              <w:top w:w="120" w:type="dxa"/>
-              <w:start w:w="160" w:type="dxa"/>
-              <w:bottom w:w="120" w:type="dxa"/>
-              <w:end w:w="160" w:type="dxa"/>
-            </w:tcMar>
-            <w:vAlign w:val="top"/>
-          </w:tcPr>
-          <w:p>
-            <w:r>
-              <w:t>6. Quais capacidades de inteligência emocional poderiam ampliar a margem de escolha do gestor naquele momento?</w:t>
+              <w:t>3. Quais necessidades parecem estar mobilizadas no gestor e no servidor? Que emoções podem emergir quando essas necessidades são atendidas, frustradas ou percebidas como ameaçadas?</w:t>
             </w:r>
           </w:p>
         </w:tc>

</xml_diff>